<commit_message>
MOD4 & 5 Commit
</commit_message>
<xml_diff>
--- a/CSC505/CSC505_Module4_Dunn_Justan/CSC505_Module4_Dunn_Justan.docx
+++ b/CSC505/CSC505_Module4_Dunn_Justan/CSC505_Module4_Dunn_Justan.docx
@@ -144,7 +144,7 @@
           <w:sz w:val="24"/>
           <w:szCs w:val="24"/>
         </w:rPr>
-        <w:t>Portfolio Milestone</w:t>
+        <w:t>Human Aspects of Software Engineering</w:t>
       </w:r>
     </w:p>
     <w:bookmarkEnd w:id="0"/>
@@ -337,16 +337,7 @@
           <w:sz w:val="24"/>
           <w:szCs w:val="24"/>
         </w:rPr>
-        <w:t>1</w:t>
-      </w:r>
-      <w:r>
-        <w:rPr>
-          <w:rStyle w:val="fnt0"/>
-          <w:rFonts w:ascii="Times New Roman" w:hAnsi="Times New Roman"/>
-          <w:sz w:val="24"/>
-          <w:szCs w:val="24"/>
-        </w:rPr>
-        <w:t>0</w:t>
+        <w:t>10</w:t>
       </w:r>
       <w:r>
         <w:rPr>
@@ -443,7 +434,227 @@
           <w:szCs w:val="24"/>
         </w:rPr>
         <w:lastRenderedPageBreak/>
-        <w:t>Module 4: Portfolio Milestone</w:t>
+        <w:t xml:space="preserve">Module </w:t>
+      </w:r>
+      <w:r>
+        <w:rPr>
+          <w:rStyle w:val="fnt0"/>
+          <w:rFonts w:ascii="Times New Roman" w:hAnsi="Times New Roman"/>
+          <w:b/>
+          <w:bCs/>
+          <w:sz w:val="24"/>
+          <w:szCs w:val="24"/>
+        </w:rPr>
+        <w:t>4</w:t>
+      </w:r>
+      <w:r>
+        <w:rPr>
+          <w:rStyle w:val="fnt0"/>
+          <w:rFonts w:ascii="Times New Roman" w:hAnsi="Times New Roman"/>
+          <w:b/>
+          <w:bCs/>
+          <w:sz w:val="24"/>
+          <w:szCs w:val="24"/>
+        </w:rPr>
+        <w:t>:</w:t>
+      </w:r>
+      <w:r>
+        <w:rPr>
+          <w:rStyle w:val="fnt0"/>
+          <w:rFonts w:ascii="Times New Roman" w:hAnsi="Times New Roman"/>
+          <w:b/>
+          <w:bCs/>
+          <w:sz w:val="24"/>
+          <w:szCs w:val="24"/>
+        </w:rPr>
+        <w:t xml:space="preserve"> </w:t>
+      </w:r>
+      <w:r>
+        <w:rPr>
+          <w:rStyle w:val="fnt0"/>
+          <w:rFonts w:ascii="Times New Roman" w:hAnsi="Times New Roman"/>
+          <w:b/>
+          <w:bCs/>
+          <w:sz w:val="24"/>
+          <w:szCs w:val="24"/>
+        </w:rPr>
+        <w:t>Human Aspects of Software Engineering</w:t>
+      </w:r>
+    </w:p>
+    <w:p>
+      <w:pPr>
+        <w:spacing w:line="480" w:lineRule="auto"/>
+        <w:ind w:firstLine="720"/>
+        <w:rPr>
+          <w:rStyle w:val="fnt0"/>
+          <w:rFonts w:ascii="Times New Roman" w:hAnsi="Times New Roman"/>
+          <w:sz w:val="24"/>
+          <w:szCs w:val="24"/>
+        </w:rPr>
+      </w:pPr>
+      <w:r>
+        <w:rPr>
+          <w:rStyle w:val="fnt0"/>
+          <w:rFonts w:ascii="Times New Roman" w:hAnsi="Times New Roman"/>
+          <w:sz w:val="24"/>
+          <w:szCs w:val="24"/>
+        </w:rPr>
+        <w:t>While software engineering often emphasizes technical skills such as programming languages, system design, and algorithm development, the human aspects of the profession are just as critical to long-term success. Software projects are rarely built in isolation; they depend on teams of developers, testers, analysts, and stakeholders working collaboratively under changing requirements and complex constraints. For this reason, personality traits and soft skills significantly influence how effectively developers contribute to a team and adapt to evolving project demands.</w:t>
+      </w:r>
+    </w:p>
+    <w:p>
+      <w:pPr>
+        <w:spacing w:line="480" w:lineRule="auto"/>
+        <w:ind w:firstLine="720"/>
+        <w:rPr>
+          <w:rStyle w:val="fnt0"/>
+          <w:rFonts w:ascii="Times New Roman" w:hAnsi="Times New Roman"/>
+          <w:sz w:val="24"/>
+          <w:szCs w:val="24"/>
+        </w:rPr>
+      </w:pPr>
+      <w:r>
+        <w:rPr>
+          <w:rStyle w:val="fnt0"/>
+          <w:rFonts w:ascii="Times New Roman" w:hAnsi="Times New Roman"/>
+          <w:sz w:val="24"/>
+          <w:szCs w:val="24"/>
+        </w:rPr>
+        <w:t>This project highlights three traits commonly observed among excellent software developers: collaboration, problem-solving, and adaptability. These qualities are not only essential to producing high-quality software but also to fostering teamwork, maintaining productivity, and ensuring sustainable development practices. To represent these traits, a UML model is used to visualize their role in shaping the profile of an effective developer. In addition, a Python program inspired by the Builder Pattern demonstrates how these traits can be assembled step by step into a cohesive framework, reinforcing the connection between conceptual modeling and practical implementation.</w:t>
+      </w:r>
+    </w:p>
+    <w:p>
+      <w:pPr>
+        <w:spacing w:line="480" w:lineRule="auto"/>
+        <w:jc w:val="center"/>
+        <w:rPr>
+          <w:b/>
+          <w:bCs/>
+        </w:rPr>
+      </w:pPr>
+      <w:r>
+        <w:rPr>
+          <w:rStyle w:val="fnt0"/>
+          <w:rFonts w:ascii="Times New Roman" w:hAnsi="Times New Roman"/>
+          <w:sz w:val="24"/>
+          <w:szCs w:val="24"/>
+        </w:rPr>
+        <w:br w:type="page"/>
+      </w:r>
+      <w:r>
+        <w:rPr>
+          <w:b/>
+          <w:bCs/>
+        </w:rPr>
+        <w:lastRenderedPageBreak/>
+        <w:t>UML Diagram</w:t>
+      </w:r>
+    </w:p>
+    <w:p>
+      <w:pPr>
+        <w:pStyle w:val="NormalWeb"/>
+        <w:spacing w:after="0" w:line="480" w:lineRule="auto"/>
+        <w:jc w:val="center"/>
+      </w:pPr>
+      <w:r>
+        <w:pict w14:anchorId="3FE41CF8">
+          <v:shapetype id="_x0000_t75" coordsize="21600,21600" o:spt="75" o:preferrelative="t" path="m@4@5l@4@11@9@11@9@5xe" filled="f" stroked="f">
+            <v:stroke joinstyle="miter"/>
+            <v:formulas>
+              <v:f eqn="if lineDrawn pixelLineWidth 0"/>
+              <v:f eqn="sum @0 1 0"/>
+              <v:f eqn="sum 0 0 @1"/>
+              <v:f eqn="prod @2 1 2"/>
+              <v:f eqn="prod @3 21600 pixelWidth"/>
+              <v:f eqn="prod @3 21600 pixelHeight"/>
+              <v:f eqn="sum @0 0 1"/>
+              <v:f eqn="prod @6 1 2"/>
+              <v:f eqn="prod @7 21600 pixelWidth"/>
+              <v:f eqn="sum @8 21600 0"/>
+              <v:f eqn="prod @7 21600 pixelHeight"/>
+              <v:f eqn="sum @10 21600 0"/>
+            </v:formulas>
+            <v:path o:extrusionok="f" gradientshapeok="t" o:connecttype="rect"/>
+            <o:lock v:ext="edit" aspectratio="t"/>
+          </v:shapetype>
+          <v:shape id="_x0000_i1030" type="#_x0000_t75" style="width:267pt;height:276.75pt">
+            <v:imagedata r:id="rId9" o:title="class_uml"/>
+          </v:shape>
+        </w:pict>
+      </w:r>
+    </w:p>
+    <w:p>
+      <w:pPr>
+        <w:pStyle w:val="NormalWeb"/>
+        <w:spacing w:after="0" w:line="480" w:lineRule="auto"/>
+        <w:jc w:val="center"/>
+        <w:rPr>
+          <w:b/>
+          <w:bCs/>
+        </w:rPr>
+      </w:pPr>
+      <w:r>
+        <w:br w:type="page"/>
+      </w:r>
+      <w:proofErr w:type="spellStart"/>
+      <w:r>
+        <w:rPr>
+          <w:b/>
+          <w:bCs/>
+        </w:rPr>
+        <w:lastRenderedPageBreak/>
+        <w:t>Use_</w:t>
+      </w:r>
+      <w:proofErr w:type="gramStart"/>
+      <w:r>
+        <w:rPr>
+          <w:b/>
+          <w:bCs/>
+        </w:rPr>
+        <w:t>case.puml</w:t>
+      </w:r>
+      <w:proofErr w:type="spellEnd"/>
+      <w:proofErr w:type="gramEnd"/>
+    </w:p>
+    <w:p>
+      <w:pPr>
+        <w:pStyle w:val="NormalWeb"/>
+        <w:spacing w:after="0" w:line="480" w:lineRule="auto"/>
+        <w:jc w:val="center"/>
+        <w:rPr>
+          <w:b/>
+          <w:bCs/>
+        </w:rPr>
+      </w:pPr>
+      <w:r>
+        <w:rPr>
+          <w:b/>
+          <w:bCs/>
+        </w:rPr>
+        <w:pict w14:anchorId="61567835">
+          <v:shape id="_x0000_i1034" type="#_x0000_t75" style="width:467.25pt;height:600pt">
+            <v:imagedata r:id="rId10" o:title="personality_traits_builder"/>
+          </v:shape>
+        </w:pict>
+      </w:r>
+    </w:p>
+    <w:p>
+      <w:pPr>
+        <w:pStyle w:val="NormalWeb"/>
+        <w:spacing w:after="0" w:line="480" w:lineRule="auto"/>
+        <w:jc w:val="center"/>
+        <w:rPr>
+          <w:b/>
+          <w:bCs/>
+        </w:rPr>
+      </w:pPr>
+      <w:r>
+        <w:rPr>
+          <w:b/>
+          <w:bCs/>
+        </w:rPr>
+        <w:lastRenderedPageBreak/>
+        <w:t>Conclusion</w:t>
       </w:r>
     </w:p>
     <w:p>
@@ -453,25 +664,15 @@
         <w:ind w:firstLine="720"/>
       </w:pPr>
       <w:r>
-        <w:t>In software development, functioning code is often considered the baseline requirement for project success. Once a program executes as expected and produces correct results, the temptation may be to move on to new features or other priorities. However, experienced developers recognize that functioning code does not always equate to optimal code. Downtime within the development cycle—whether due to waiting for client feedback, dependency integration, or simply reaching a temporary project plateau—offers an important opportunity to iterate on and streamline existing code. These refinements improve efficiency, maintainability, and scalability while reducing long-term costs of technical debt.</w:t>
-      </w:r>
-    </w:p>
-    <w:p>
-      <w:pPr>
-        <w:pStyle w:val="NormalWeb"/>
-        <w:spacing w:after="0" w:line="480" w:lineRule="auto"/>
-        <w:jc w:val="center"/>
-        <w:rPr>
-          <w:b/>
-          <w:bCs/>
-        </w:rPr>
-      </w:pPr>
-      <w:r>
-        <w:rPr>
-          <w:b/>
-          <w:bCs/>
-        </w:rPr>
-        <w:t>Streamlining for Maintainability</w:t>
+        <w:t xml:space="preserve">The UML diagram and Python script demonstrate how collaboration, problem-solving, and </w:t>
+      </w:r>
+      <w:proofErr w:type="gramStart"/>
+      <w:r>
+        <w:t>adaptability—</w:t>
+      </w:r>
+      <w:proofErr w:type="gramEnd"/>
+      <w:r>
+        <w:t>three essential traits—form the foundation of effective software development. By modeling traits as modular components in UML and applying the Builder Pattern in Python, the program highlights both the structural and behavioral aspects of successful software engineering. This approach reinforces the idea that excellent developers are not defined by technical skills alone, but by personal qualities that enable long-term success in dynamic, team-driven environments.</w:t>
       </w:r>
     </w:p>
     <w:p>
@@ -479,36 +680,41 @@
         <w:pStyle w:val="NormalWeb"/>
         <w:spacing w:after="0" w:line="480" w:lineRule="auto"/>
         <w:ind w:firstLine="720"/>
-      </w:pPr>
-      <w:r>
-        <w:t>One of the most significant benefits of revisiting functioning code is maintainability. Even if the code produces accurate results today, the likelihood of future changes is high as business needs evolve. During downtime, developers can enhance readability by simplifying logic, improving naming conventions, and refactoring repetitive sections into reusable functions or classes. Clearer, modular code reduces onboarding time for new team members and minimizes errors when updates are required later. This proactive refinement ensures the system remains adaptable without incurring delays when urgent modifications arise.</w:t>
+        <w:jc w:val="center"/>
+        <w:rPr>
+          <w:b/>
+          <w:bCs/>
+        </w:rPr>
+      </w:pPr>
+      <w:r>
+        <w:rPr>
+          <w:b/>
+          <w:bCs/>
+        </w:rPr>
+        <w:br w:type="page"/>
+      </w:r>
+      <w:r>
+        <w:rPr>
+          <w:b/>
+          <w:bCs/>
+        </w:rPr>
+        <w:lastRenderedPageBreak/>
+        <w:t>References</w:t>
       </w:r>
     </w:p>
     <w:p>
       <w:pPr>
         <w:pStyle w:val="NormalWeb"/>
         <w:spacing w:after="0" w:line="480" w:lineRule="auto"/>
-        <w:jc w:val="center"/>
-        <w:rPr>
-          <w:b/>
-          <w:bCs/>
-        </w:rPr>
-      </w:pPr>
-      <w:proofErr w:type="gramStart"/>
-      <w:r>
-        <w:rPr>
-          <w:b/>
-          <w:bCs/>
-        </w:rPr>
-        <w:t>Optimizing for</w:t>
-      </w:r>
-      <w:proofErr w:type="gramEnd"/>
-      <w:r>
-        <w:rPr>
-          <w:b/>
-          <w:bCs/>
-        </w:rPr>
-        <w:t xml:space="preserve"> Performance</w:t>
+        <w:rPr>
+          <w:color w:val="000000"/>
+        </w:rPr>
+      </w:pPr>
+      <w:r>
+        <w:rPr>
+          <w:color w:val="000000"/>
+        </w:rPr>
+        <w:t xml:space="preserve">Pressman, R. S., &amp; Maxim, B. R. (2020). Software engineering: A practitioner’s approach </w:t>
       </w:r>
     </w:p>
     <w:p>
@@ -516,389 +722,21 @@
         <w:pStyle w:val="NormalWeb"/>
         <w:spacing w:after="0" w:line="480" w:lineRule="auto"/>
         <w:ind w:firstLine="720"/>
-      </w:pPr>
-      <w:r>
-        <w:t xml:space="preserve">Downtime is also a valuable opportunity to optimize performance. Functioning code may use inefficient algorithms, unnecessary loops, or redundant database calls that increase execution time or strain system resources. By analyzing performance bottlenecks and applying best </w:t>
-      </w:r>
-      <w:r>
-        <w:lastRenderedPageBreak/>
-        <w:t>practices, developers can create a leaner, faster solution without disrupting delivery schedules. This is particularly critical in environments with large datasets, high user loads, or resource-limited hardware. Incremental improvements made during periods of low pressure can yield measurable performance gains once the application scales.</w:t>
+        <w:rPr>
+          <w:color w:val="000000"/>
+        </w:rPr>
+      </w:pPr>
+      <w:r>
+        <w:rPr>
+          <w:color w:val="000000"/>
+        </w:rPr>
+        <w:t>(9th ed.). McGraw-Hill Education.</w:t>
       </w:r>
     </w:p>
     <w:p>
       <w:pPr>
         <w:pStyle w:val="NormalWeb"/>
         <w:spacing w:after="0" w:line="480" w:lineRule="auto"/>
-        <w:jc w:val="center"/>
-        <w:rPr>
-          <w:b/>
-          <w:bCs/>
-        </w:rPr>
-      </w:pPr>
-      <w:r>
-        <w:rPr>
-          <w:b/>
-          <w:bCs/>
-        </w:rPr>
-        <w:t>Reducing Technical Debt</w:t>
-      </w:r>
-    </w:p>
-    <w:p>
-      <w:pPr>
-        <w:pStyle w:val="NormalWeb"/>
-        <w:spacing w:after="0" w:line="480" w:lineRule="auto"/>
-        <w:ind w:firstLine="720"/>
-      </w:pPr>
-      <w:r>
-        <w:t>Iterative streamlining during downtime directly addresses technical debt—the hidden cost of “quick fixes” or rushed development. Left unaddressed, technical debt accumulates and eventually slows progress as developers spend more time working around poorly structured code than delivering new features. Proactively improving functioning code helps prevent this debt from ballooning. In effect, developers are “paying down” debt in small installments, preserving system stability and saving significant effort in future maintenance cycles.</w:t>
-      </w:r>
-    </w:p>
-    <w:p>
-      <w:pPr>
-        <w:pStyle w:val="NormalWeb"/>
-        <w:spacing w:after="0" w:line="480" w:lineRule="auto"/>
-        <w:jc w:val="center"/>
-        <w:rPr>
-          <w:b/>
-          <w:bCs/>
-        </w:rPr>
-      </w:pPr>
-      <w:r>
-        <w:rPr>
-          <w:b/>
-          <w:bCs/>
-        </w:rPr>
-        <w:t>Enhancing Reliability and Testing</w:t>
-      </w:r>
-    </w:p>
-    <w:p>
-      <w:pPr>
-        <w:pStyle w:val="NormalWeb"/>
-        <w:spacing w:after="0" w:line="480" w:lineRule="auto"/>
-        <w:ind w:firstLine="720"/>
-      </w:pPr>
-      <w:r>
-        <w:t xml:space="preserve">Finally, downtime is an excellent chance to expand testing coverage and ensure that functioning code remains reliable under edge cases or unexpected conditions. Writing additional unit tests, integration tests, or even </w:t>
-      </w:r>
-      <w:proofErr w:type="gramStart"/>
-      <w:r>
-        <w:t>exploratory</w:t>
-      </w:r>
-      <w:proofErr w:type="gramEnd"/>
-      <w:r>
-        <w:t xml:space="preserve"> tests strengthens quality assurance. These practices reduce the risk of regression bugs when new functionality is introduced. Streamlining code often makes it easier to test, as smaller, well-structured modules lend themselves naturally to unit testing frameworks.</w:t>
-      </w:r>
-    </w:p>
-    <w:p>
-      <w:pPr>
-        <w:pStyle w:val="NormalWeb"/>
-        <w:spacing w:after="0" w:line="480" w:lineRule="auto"/>
-        <w:jc w:val="center"/>
-        <w:rPr>
-          <w:b/>
-          <w:bCs/>
-        </w:rPr>
-      </w:pPr>
-      <w:r>
-        <w:rPr>
-          <w:b/>
-          <w:bCs/>
-        </w:rPr>
-        <w:t>Conclusion</w:t>
-      </w:r>
-    </w:p>
-    <w:p>
-      <w:pPr>
-        <w:pStyle w:val="NormalWeb"/>
-        <w:spacing w:after="0" w:line="480" w:lineRule="auto"/>
-        <w:ind w:firstLine="720"/>
-      </w:pPr>
-      <w:r>
-        <w:lastRenderedPageBreak/>
-        <w:t>While functioning code meets immediate project requirements, streamlining it during downtime maximizes long-term project success. Enhancements in maintainability, performance, and reliability not only reduce costs but also improve the developer experience by minimizing frustration when changes are needed. Iterating on code during slower project phases is an investment in sustainability—one that ensures software remains robust, efficient, and adaptable well beyond its initial deployment.</w:t>
-      </w:r>
-    </w:p>
-    <w:p>
-      <w:pPr>
-        <w:spacing w:after="0" w:line="480" w:lineRule="auto"/>
-        <w:jc w:val="center"/>
-        <w:rPr>
-          <w:rStyle w:val="fnt0"/>
-          <w:rFonts w:ascii="Times New Roman" w:hAnsi="Times New Roman"/>
-          <w:b/>
-          <w:bCs/>
-          <w:sz w:val="24"/>
-          <w:szCs w:val="24"/>
-        </w:rPr>
-      </w:pPr>
-      <w:r>
-        <w:rPr>
-          <w:rStyle w:val="fnt0"/>
-          <w:rFonts w:ascii="Times New Roman" w:hAnsi="Times New Roman"/>
-          <w:b/>
-          <w:bCs/>
-          <w:sz w:val="24"/>
-          <w:szCs w:val="24"/>
-        </w:rPr>
-        <w:t>Module 1:</w:t>
-      </w:r>
-      <w:r>
-        <w:rPr>
-          <w:rStyle w:val="fnt0"/>
-          <w:rFonts w:ascii="Times New Roman" w:hAnsi="Times New Roman"/>
-          <w:b/>
-          <w:bCs/>
-          <w:sz w:val="24"/>
-          <w:szCs w:val="24"/>
-        </w:rPr>
-        <w:t xml:space="preserve"> Software and Software Engineering</w:t>
-      </w:r>
-    </w:p>
-    <w:p>
-      <w:pPr>
-        <w:pStyle w:val="NormalWeb"/>
-        <w:spacing w:after="0" w:line="480" w:lineRule="auto"/>
-        <w:jc w:val="center"/>
-        <w:rPr>
-          <w:b/>
-          <w:bCs/>
-          <w:sz w:val="22"/>
-          <w:szCs w:val="22"/>
-        </w:rPr>
-      </w:pPr>
-      <w:hyperlink r:id="rId9" w:history="1">
-        <w:r>
-          <w:rPr>
-            <w:rStyle w:val="Hyperlink"/>
-            <w:b/>
-            <w:bCs/>
-            <w:sz w:val="22"/>
-            <w:szCs w:val="22"/>
-          </w:rPr>
-          <w:t>https://github.com/justandunn/CSU-Global-MS-AI-ML/tree/c34932cdb744425e0fb94670d53c8b8f10c5728a/CSC505/CSC505_Module1_Dunn_Justan</w:t>
-        </w:r>
-      </w:hyperlink>
-    </w:p>
-    <w:p>
-      <w:pPr>
-        <w:spacing w:after="0" w:line="480" w:lineRule="auto"/>
-        <w:jc w:val="center"/>
-        <w:rPr>
-          <w:rStyle w:val="fnt0"/>
-          <w:rFonts w:ascii="Times New Roman" w:hAnsi="Times New Roman"/>
-          <w:b/>
-          <w:bCs/>
-          <w:sz w:val="24"/>
-          <w:szCs w:val="24"/>
-        </w:rPr>
-      </w:pPr>
-      <w:r>
-        <w:rPr>
-          <w:rStyle w:val="fnt0"/>
-          <w:rFonts w:ascii="Times New Roman" w:hAnsi="Times New Roman"/>
-          <w:b/>
-          <w:bCs/>
-          <w:sz w:val="24"/>
-          <w:szCs w:val="24"/>
-        </w:rPr>
-        <w:t xml:space="preserve">Module </w:t>
-      </w:r>
-      <w:r>
-        <w:rPr>
-          <w:rStyle w:val="fnt0"/>
-          <w:rFonts w:ascii="Times New Roman" w:hAnsi="Times New Roman"/>
-          <w:b/>
-          <w:bCs/>
-          <w:sz w:val="24"/>
-          <w:szCs w:val="24"/>
-        </w:rPr>
-        <w:t>2</w:t>
-      </w:r>
-      <w:r>
-        <w:rPr>
-          <w:rStyle w:val="fnt0"/>
-          <w:rFonts w:ascii="Times New Roman" w:hAnsi="Times New Roman"/>
-          <w:b/>
-          <w:bCs/>
-          <w:sz w:val="24"/>
-          <w:szCs w:val="24"/>
-        </w:rPr>
-        <w:t>:</w:t>
-      </w:r>
-      <w:r>
-        <w:rPr>
-          <w:rStyle w:val="fnt0"/>
-          <w:rFonts w:ascii="Times New Roman" w:hAnsi="Times New Roman"/>
-          <w:b/>
-          <w:bCs/>
-          <w:sz w:val="24"/>
-          <w:szCs w:val="24"/>
-        </w:rPr>
-        <w:t xml:space="preserve"> Software Process Models</w:t>
-      </w:r>
-    </w:p>
-    <w:p>
-      <w:pPr>
-        <w:pStyle w:val="NormalWeb"/>
-        <w:spacing w:after="0" w:line="480" w:lineRule="auto"/>
-        <w:jc w:val="center"/>
-        <w:rPr>
-          <w:b/>
-          <w:bCs/>
-          <w:sz w:val="22"/>
-          <w:szCs w:val="22"/>
-        </w:rPr>
-      </w:pPr>
-      <w:hyperlink r:id="rId10" w:history="1">
-        <w:r>
-          <w:rPr>
-            <w:rStyle w:val="Hyperlink"/>
-            <w:b/>
-            <w:bCs/>
-            <w:sz w:val="22"/>
-            <w:szCs w:val="22"/>
-          </w:rPr>
-          <w:t>https://github.com/justandunn/CSU-Global-MS-AI-ML/tree/c34932cdb744425e0fb94670d53c8b8f10c5728a/CSC505/CSC505_Module2_Dunn_Justan</w:t>
-        </w:r>
-      </w:hyperlink>
-    </w:p>
-    <w:p>
-      <w:pPr>
-        <w:spacing w:after="0" w:line="480" w:lineRule="auto"/>
-        <w:jc w:val="center"/>
-        <w:rPr>
-          <w:rStyle w:val="fnt0"/>
-          <w:rFonts w:ascii="Times New Roman" w:hAnsi="Times New Roman"/>
-          <w:b/>
-          <w:bCs/>
-          <w:sz w:val="24"/>
-          <w:szCs w:val="24"/>
-        </w:rPr>
-      </w:pPr>
-      <w:r>
-        <w:rPr>
-          <w:rStyle w:val="fnt0"/>
-          <w:rFonts w:ascii="Times New Roman" w:hAnsi="Times New Roman"/>
-          <w:b/>
-          <w:bCs/>
-          <w:sz w:val="24"/>
-          <w:szCs w:val="24"/>
-        </w:rPr>
-        <w:t xml:space="preserve">Module </w:t>
-      </w:r>
-      <w:r>
-        <w:rPr>
-          <w:rStyle w:val="fnt0"/>
-          <w:rFonts w:ascii="Times New Roman" w:hAnsi="Times New Roman"/>
-          <w:b/>
-          <w:bCs/>
-          <w:sz w:val="24"/>
-          <w:szCs w:val="24"/>
-        </w:rPr>
-        <w:t>3</w:t>
-      </w:r>
-      <w:r>
-        <w:rPr>
-          <w:rStyle w:val="fnt0"/>
-          <w:rFonts w:ascii="Times New Roman" w:hAnsi="Times New Roman"/>
-          <w:b/>
-          <w:bCs/>
-          <w:sz w:val="24"/>
-          <w:szCs w:val="24"/>
-        </w:rPr>
-        <w:t>:</w:t>
-      </w:r>
-      <w:r>
-        <w:rPr>
-          <w:rStyle w:val="fnt0"/>
-          <w:rFonts w:ascii="Times New Roman" w:hAnsi="Times New Roman"/>
-          <w:b/>
-          <w:bCs/>
-          <w:sz w:val="24"/>
-          <w:szCs w:val="24"/>
-        </w:rPr>
-        <w:t xml:space="preserve"> </w:t>
-      </w:r>
-      <w:r>
-        <w:rPr>
-          <w:rStyle w:val="fnt0"/>
-          <w:rFonts w:ascii="Times New Roman" w:hAnsi="Times New Roman"/>
-          <w:b/>
-          <w:bCs/>
-          <w:sz w:val="24"/>
-          <w:szCs w:val="24"/>
-        </w:rPr>
-        <w:t>Agility and Process with Recommended Process Model</w:t>
-      </w:r>
-    </w:p>
-    <w:p>
-      <w:pPr>
-        <w:pStyle w:val="NormalWeb"/>
-        <w:spacing w:after="0" w:line="480" w:lineRule="auto"/>
-        <w:jc w:val="center"/>
-        <w:rPr>
-          <w:b/>
-          <w:bCs/>
-          <w:sz w:val="22"/>
-          <w:szCs w:val="22"/>
-        </w:rPr>
-      </w:pPr>
-      <w:hyperlink r:id="rId11" w:history="1">
-        <w:r>
-          <w:rPr>
-            <w:rStyle w:val="Hyperlink"/>
-            <w:b/>
-            <w:bCs/>
-            <w:sz w:val="22"/>
-            <w:szCs w:val="22"/>
-          </w:rPr>
-          <w:t>https://github.com/justandunn/CSU-Global-MS-AI-ML/tree/c34932cdb744425e0fb94670d53c8b8f10c5728a/CSC505/CSC505_Module3_Dunn_Justan</w:t>
-        </w:r>
-      </w:hyperlink>
-    </w:p>
-    <w:p>
-      <w:pPr>
-        <w:pStyle w:val="NormalWeb"/>
-        <w:spacing w:after="0" w:line="480" w:lineRule="auto"/>
-        <w:jc w:val="center"/>
-        <w:rPr>
-          <w:b/>
-          <w:bCs/>
-          <w:sz w:val="22"/>
-          <w:szCs w:val="22"/>
-        </w:rPr>
-      </w:pPr>
-    </w:p>
-    <w:p>
-      <w:pPr>
-        <w:pStyle w:val="NormalWeb"/>
-        <w:spacing w:after="0" w:line="480" w:lineRule="auto"/>
-        <w:jc w:val="center"/>
-        <w:rPr>
-          <w:b/>
-          <w:bCs/>
-        </w:rPr>
-      </w:pPr>
-      <w:r>
-        <w:rPr>
-          <w:b/>
-          <w:bCs/>
-        </w:rPr>
-        <w:br w:type="page"/>
-      </w:r>
-      <w:r>
-        <w:rPr>
-          <w:b/>
-          <w:bCs/>
-        </w:rPr>
-        <w:lastRenderedPageBreak/>
-        <w:t>References</w:t>
-      </w:r>
-    </w:p>
-    <w:p>
-      <w:pPr>
-        <w:pStyle w:val="NormalWeb"/>
-        <w:spacing w:after="0" w:line="480" w:lineRule="auto"/>
         <w:rPr>
           <w:color w:val="000000"/>
         </w:rPr>
@@ -907,59 +745,12 @@
         <w:rPr>
           <w:color w:val="000000"/>
         </w:rPr>
-        <w:t>Fowler, M. (2018). Refactoring: Improving the design of existing code (2nd ed.). Addison-</w:t>
-      </w:r>
-    </w:p>
-    <w:p>
-      <w:pPr>
-        <w:pStyle w:val="NormalWeb"/>
-        <w:spacing w:after="0" w:line="480" w:lineRule="auto"/>
-        <w:ind w:firstLine="720"/>
-        <w:rPr>
-          <w:color w:val="000000"/>
-        </w:rPr>
-      </w:pPr>
-      <w:r>
-        <w:rPr>
-          <w:color w:val="000000"/>
-        </w:rPr>
-        <w:t>Wesley Professional.</w:t>
-      </w:r>
-    </w:p>
-    <w:p>
-      <w:pPr>
-        <w:pStyle w:val="NormalWeb"/>
-        <w:spacing w:after="0" w:line="480" w:lineRule="auto"/>
-        <w:rPr>
-          <w:color w:val="000000"/>
-        </w:rPr>
-      </w:pPr>
-      <w:r>
-        <w:rPr>
-          <w:color w:val="000000"/>
-        </w:rPr>
-        <w:t xml:space="preserve">Pressman, R. S., &amp; Maxim, B. R. (2020). Software engineering: A practitioner’s approach </w:t>
-      </w:r>
-    </w:p>
-    <w:p>
-      <w:pPr>
-        <w:pStyle w:val="NormalWeb"/>
-        <w:spacing w:after="0" w:line="480" w:lineRule="auto"/>
-        <w:ind w:firstLine="720"/>
-        <w:rPr>
-          <w:color w:val="000000"/>
-        </w:rPr>
-      </w:pPr>
-      <w:r>
-        <w:rPr>
-          <w:color w:val="000000"/>
-        </w:rPr>
-        <w:t>(9th ed.). McGraw-Hill Education.</w:t>
+        <w:t>Sommerville, I. (2016). Software engineering (10th ed.). Pearson.</w:t>
       </w:r>
     </w:p>
     <w:sectPr>
-      <w:headerReference w:type="default" r:id="rId12"/>
-      <w:headerReference w:type="first" r:id="rId13"/>
+      <w:headerReference w:type="default" r:id="rId11"/>
+      <w:headerReference w:type="first" r:id="rId12"/>
       <w:pgSz w:w="12240" w:h="15840"/>
       <w:pgMar w:top="1440" w:right="1440" w:bottom="1440" w:left="1440" w:header="720" w:footer="720" w:gutter="0"/>
       <w:cols w:space="720"/>

</xml_diff>